<commit_message>
Update report with current PR pipeline evidence
</commit_message>
<xml_diff>
--- a/docs/REPORT_Midterm_Kazikhanov.docx
+++ b/docs/REPORT_Midterm_Kazikhanov.docx
@@ -7275,7 +7275,7 @@
                 <w:color w:val="000000"/>
                 <w:sz w:val="24"/>
               </w:rPr>
-              <w:t>https://github.com/Svoppy/QA_drf-api/actions/runs/23952188937</w:t>
+              <w:t>https://github.com/Svoppy/QA_drf-api/actions/runs/24211718046</w:t>
             </w:r>
           </w:p>
         </w:tc>
@@ -9458,7 +9458,7 @@
                 <w:color w:val="000000"/>
                 <w:sz w:val="24"/>
               </w:rPr>
-              <w:t>Workflow run #12</w:t>
+              <w:t>Workflow run #13</w:t>
             </w:r>
           </w:p>
         </w:tc>
@@ -9478,7 +9478,7 @@
                 <w:color w:val="000000"/>
                 <w:sz w:val="24"/>
               </w:rPr>
-              <w:t>2026-04-03 15:46:12 UTC</w:t>
+              <w:t>2026-04-09 20:27:38 UTC</w:t>
             </w:r>
           </w:p>
         </w:tc>
@@ -9498,7 +9498,7 @@
                 <w:color w:val="000000"/>
                 <w:sz w:val="24"/>
               </w:rPr>
-              <w:t>2026-04-03 15:51:54 UTC</w:t>
+              <w:t>2026-04-09 20:32:18 UTC</w:t>
             </w:r>
           </w:p>
         </w:tc>
@@ -9518,7 +9518,7 @@
                 <w:color w:val="000000"/>
                 <w:sz w:val="24"/>
               </w:rPr>
-              <w:t>5m 42s</w:t>
+              <w:t>4m 40s</w:t>
             </w:r>
           </w:p>
         </w:tc>
@@ -9580,7 +9580,7 @@
                 <w:color w:val="000000"/>
                 <w:sz w:val="24"/>
               </w:rPr>
-              <w:t>15:46:16 UTC</w:t>
+              <w:t>20:27:42 UTC</w:t>
             </w:r>
           </w:p>
         </w:tc>
@@ -9600,7 +9600,7 @@
                 <w:color w:val="000000"/>
                 <w:sz w:val="24"/>
               </w:rPr>
-              <w:t>15:46:47 UTC</w:t>
+              <w:t>20:28:22 UTC</w:t>
             </w:r>
           </w:p>
         </w:tc>
@@ -9620,7 +9620,7 @@
                 <w:color w:val="000000"/>
                 <w:sz w:val="24"/>
               </w:rPr>
-              <w:t>31s</w:t>
+              <w:t>40s</w:t>
             </w:r>
           </w:p>
         </w:tc>
@@ -9682,7 +9682,7 @@
                 <w:color w:val="000000"/>
                 <w:sz w:val="24"/>
               </w:rPr>
-              <w:t>15:46:51 UTC</w:t>
+              <w:t>20:28:26 UTC</w:t>
             </w:r>
           </w:p>
         </w:tc>
@@ -9702,7 +9702,7 @@
                 <w:color w:val="000000"/>
                 <w:sz w:val="24"/>
               </w:rPr>
-              <w:t>15:48:34 UTC</w:t>
+              <w:t>20:30:02 UTC</w:t>
             </w:r>
           </w:p>
         </w:tc>
@@ -9722,7 +9722,7 @@
                 <w:color w:val="000000"/>
                 <w:sz w:val="24"/>
               </w:rPr>
-              <w:t>1m 43s</w:t>
+              <w:t>1m 36s</w:t>
             </w:r>
           </w:p>
         </w:tc>
@@ -9784,7 +9784,7 @@
                 <w:color w:val="000000"/>
                 <w:sz w:val="24"/>
               </w:rPr>
-              <w:t>15:48:38 UTC</w:t>
+              <w:t>20:30:06 UTC</w:t>
             </w:r>
           </w:p>
         </w:tc>
@@ -9804,7 +9804,7 @@
                 <w:color w:val="000000"/>
                 <w:sz w:val="24"/>
               </w:rPr>
-              <w:t>15:50:42 UTC</w:t>
+              <w:t>20:32:17 UTC</w:t>
             </w:r>
           </w:p>
         </w:tc>
@@ -9824,7 +9824,7 @@
                 <w:color w:val="000000"/>
                 <w:sz w:val="24"/>
               </w:rPr>
-              <w:t>2m 04s</w:t>
+              <w:t>2m 11s</w:t>
             </w:r>
           </w:p>
         </w:tc>
@@ -9886,7 +9886,7 @@
                 <w:color w:val="000000"/>
                 <w:sz w:val="24"/>
               </w:rPr>
-              <w:t>15:50:46 UTC</w:t>
+              <w:t>20:32:17 UTC</w:t>
             </w:r>
           </w:p>
         </w:tc>
@@ -9906,7 +9906,7 @@
                 <w:color w:val="000000"/>
                 <w:sz w:val="24"/>
               </w:rPr>
-              <w:t>15:51:54 UTC</w:t>
+              <w:t>20:32:17 UTC</w:t>
             </w:r>
           </w:p>
         </w:tc>
@@ -9926,7 +9926,7 @@
                 <w:color w:val="000000"/>
                 <w:sz w:val="24"/>
               </w:rPr>
-              <w:t>1m 08s</w:t>
+              <w:t>0s</w:t>
             </w:r>
           </w:p>
         </w:tc>
@@ -9946,7 +9946,7 @@
                 <w:color w:val="000000"/>
                 <w:sz w:val="24"/>
               </w:rPr>
-              <w:t>Success</w:t>
+              <w:t>Skipped on pull_request</w:t>
             </w:r>
           </w:p>
         </w:tc>
@@ -10151,7 +10151,7 @@
           <w:color w:val="000000"/>
           <w:sz w:val="24"/>
         </w:rPr>
-        <w:t>Pipeline run URL: https://github.com/Svoppy/QA_drf-api/actions/runs/23952188937</w:t>
+        <w:t>Pipeline run URL: https://github.com/Svoppy/QA_drf-api/actions/runs/24211718046</w:t>
       </w:r>
     </w:p>
     <w:p>
@@ -10170,7 +10170,7 @@
               <a:graphicData uri="http://schemas.openxmlformats.org/drawingml/2006/picture">
                 <pic:pic>
                   <pic:nvPicPr>
-                    <pic:cNvPr id="0" name="pipeline_run.png"/>
+                    <pic:cNvPr id="0" name="pipeline_run_current.png"/>
                     <pic:cNvPicPr/>
                   </pic:nvPicPr>
                   <pic:blipFill>
@@ -10214,7 +10214,7 @@
       <w:r>
         <w:drawing>
           <wp:inline xmlns:a="http://schemas.openxmlformats.org/drawingml/2006/main" xmlns:pic="http://schemas.openxmlformats.org/drawingml/2006/picture">
-            <wp:extent cx="5669280" cy="10236200"/>
+            <wp:extent cx="5669280" cy="9448800"/>
             <wp:docPr id="5" name="Picture 5"/>
             <wp:cNvGraphicFramePr>
               <a:graphicFrameLocks noChangeAspect="1"/>
@@ -10223,7 +10223,7 @@
               <a:graphicData uri="http://schemas.openxmlformats.org/drawingml/2006/picture">
                 <pic:pic>
                   <pic:nvPicPr>
-                    <pic:cNvPr id="0" name="pipeline_job_unit.png"/>
+                    <pic:cNvPr id="0" name="pipeline_job_unit_current.png"/>
                     <pic:cNvPicPr/>
                   </pic:nvPicPr>
                   <pic:blipFill>
@@ -10235,7 +10235,7 @@
                   <pic:spPr>
                     <a:xfrm>
                       <a:off x="0" y="0"/>
-                      <a:ext cx="5669280" cy="10236200"/>
+                      <a:ext cx="5669280" cy="9448800"/>
                     </a:xfrm>
                     <a:prstGeom prst="rect"/>
                   </pic:spPr>
@@ -10338,7 +10338,7 @@
                 <w:color w:val="000000"/>
                 <w:sz w:val="24"/>
               </w:rPr>
-              <w:t>GitHub Actions run #12</w:t>
+              <w:t>GitHub Actions run #13</w:t>
             </w:r>
           </w:p>
         </w:tc>
@@ -10993,7 +10993,7 @@
                 <w:color w:val="000000"/>
                 <w:sz w:val="24"/>
               </w:rPr>
-              <w:t>Workflow exists and successful run #12 is documented</w:t>
+              <w:t>Workflow exists and successful PR run #13 is documented for the current midterm snapshot</w:t>
             </w:r>
           </w:p>
         </w:tc>
@@ -11013,7 +11013,7 @@
                 <w:color w:val="000000"/>
                 <w:sz w:val="24"/>
               </w:rPr>
-              <w:t>Current report now includes pipeline evidence</w:t>
+              <w:t>Current report includes matching pipeline evidence</w:t>
             </w:r>
           </w:p>
         </w:tc>

</xml_diff>